<commit_message>
docs: atualizar DOCFUNCIONALIDADES PT e EN (conteudo do gerador)
Made-with: Cursor
</commit_message>
<xml_diff>
--- a/docs/DOCFUNCIONALIDADES_EN.docx
+++ b/docs/DOCFUNCIONALIDADES_EN.docx
@@ -13,7 +13,7 @@
     </w:p>
     <w:p>
       <w:r>
-        <w:t>This document is split for two audiences: plain-language explanation first, then a technical section covering architecture, engineering state, and codebase maturity.</w:t>
+        <w:t>Parts 1 and 2 use plain language; Part 3 describes architecture and code organisation (client, server, main folders, and technologies).</w:t>
       </w:r>
     </w:p>
     <w:p>
@@ -153,7 +153,7 @@
         <w:pStyle w:val="Heading1"/>
       </w:pPr>
       <w:r>
-        <w:t>Part 3 — Architecture, engineering, and area status</w:t>
+        <w:t>Part 3 — Architecture and code organisation</w:t>
       </w:r>
     </w:p>
     <w:p>
@@ -174,22 +174,22 @@
         <w:pStyle w:val="Heading2"/>
       </w:pPr>
       <w:r>
-        <w:t>Current state by area</w:t>
+        <w:t>Organisation by area</w:t>
       </w:r>
     </w:p>
     <w:p>
       <w:r>
-        <w:t>Backend: closer to a professional structure with routes/, services/, utils/, schema/, workers/, and db/connection.js; however server.js is still larger than ideal.</w:t>
+        <w:t>Backend: directories routes/, services/, utils/, schema/, workers/, and file db/connection.js; a significant amount of logic still lives in server.js.</w:t>
       </w:r>
     </w:p>
     <w:p>
       <w:r>
-        <w:t>React Native app: partial extraction to src/ happened (config, types, http services, utils, map, MapaTab), but App.tsx still centralizes many responsibilities.</w:t>
+        <w:t>React Native app: modules under src/ include config, types, http services, utils, map/, and screens/MapaTab.tsx; App.tsx holds most of the UI-related code.</w:t>
       </w:r>
     </w:p>
     <w:p>
       <w:r>
-        <w:t>Reliability/maintenance: improved with health checks, timeouts, SQL troubleshooting guidance, and .env separation. Next natural step is screen-based and hook-based modularization.</w:t>
+        <w:t>API: health check endpoint, request timeouts, SQL connection troubleshooting messages, and configuration via .env variables.</w:t>
       </w:r>
     </w:p>
     <w:p>
@@ -213,85 +213,6 @@
     <w:p>
       <w:r>
         <w:t>PowerShell/BAT scripts for SQL environment setup and operations.</w:t>
-      </w:r>
-    </w:p>
-    <w:p>
-      <w:pPr>
-        <w:pStyle w:val="Heading1"/>
-      </w:pPr>
-      <w:r>
-        <w:t>Part 4 — Honest assessment: professional level?</w:t>
-      </w:r>
-    </w:p>
-    <w:p>
-      <w:r>
-        <w:t>Partly yes; as a whole, not yet at the level of a fully screen-modular app. It is still a serious, viable project for portfolio use and incremental production hardening.</w:t>
-      </w:r>
-    </w:p>
-    <w:p>
-      <w:pPr>
-        <w:pStyle w:val="Heading2"/>
-      </w:pPr>
-      <w:r>
-        <w:t>Straight talk (what still weighs on the codebase)</w:t>
-      </w:r>
-    </w:p>
-    <w:p>
-      <w:r>
-        <w:t>1) Frontend: monolithic App.tsx. Impact: harder reviews and refactors. Direction: split into screens/hooks/shared components.</w:t>
-      </w:r>
-    </w:p>
-    <w:p>
-      <w:r>
-        <w:t>2) Backend: large server.js. Impact: continued growth in one file. Direction: domain-based route modules.</w:t>
-      </w:r>
-    </w:p>
-    <w:p>
-      <w:r>
-        <w:t>3) Limited visible automated tests. Impact: higher regression risk. Direction: API tests for critical endpoints + smoke tests.</w:t>
-      </w:r>
-    </w:p>
-    <w:p>
-      <w:r>
-        <w:t>4) Environment complexity. Impact: onboarding mistakes. Direction: one setup guide with required variables.</w:t>
-      </w:r>
-    </w:p>
-    <w:p>
-      <w:r>
-        <w:t>5) Many SQL scripts over time. Impact: wrong-script execution risk. Direction: standardized bootstrap flow and script headers.</w:t>
-      </w:r>
-    </w:p>
-    <w:p>
-      <w:r>
-        <w:t>6) Observability: useful logs but not strongly structured. Direction: standardized logging and centralized error handling.</w:t>
-      </w:r>
-    </w:p>
-    <w:p>
-      <w:r>
-        <w:t>7) Operational security: keep .env out of Git, review secrets regularly, enforce HTTPS for production.</w:t>
-      </w:r>
-    </w:p>
-    <w:p>
-      <w:pPr>
-        <w:pStyle w:val="Heading2"/>
-      </w:pPr>
-      <w:r>
-        <w:t>Final summary (EN)</w:t>
-      </w:r>
-    </w:p>
-    <w:p>
-      <w:r>
-        <w:t>Architecture: backend is currently more modular than the app layer.</w:t>
-      </w:r>
-    </w:p>
-    <w:p>
-      <w:r>
-        <w:t>Maintenance: primary debt remains App.tsx and server.js size.</w:t>
-      </w:r>
-    </w:p>
-    <w:p>
-      <w:r>
-        <w:t>Professionalism: solid base for portfolio and incremental production evolution.</w:t>
       </w:r>
     </w:p>
     <w:sectPr>

</xml_diff>